<commit_message>
add UI and database
</commit_message>
<xml_diff>
--- a/documents/Mô tả nghiệp vụ.docx
+++ b/documents/Mô tả nghiệp vụ.docx
@@ -10,8 +10,20 @@
     <w:p>
       <w:pPr>
         <w:jc w:val="both"/>
-      </w:pPr>
-      <w:r>
+        <w:rPr>
+          <w:b/>
+          <w:bCs/>
+          <w:sz w:val="32"/>
+          <w:szCs w:val="32"/>
+        </w:rPr>
+      </w:pPr>
+      <w:r>
+        <w:rPr>
+          <w:b/>
+          <w:bCs/>
+          <w:sz w:val="32"/>
+          <w:szCs w:val="32"/>
+        </w:rPr>
         <w:t xml:space="preserve">Mô tả nghiệp vụ: </w:t>
       </w:r>
     </w:p>
@@ -74,11 +86,16 @@
         <w:t xml:space="preserve">: danh sách sinh viên </w:t>
       </w:r>
       <w:r>
-        <w:t>vi phạm tác phong, thời điểm và địa điểm vi phạm cao điểm,</w:t>
+        <w:t xml:space="preserve">vi phạm tác phong, thời điểm và địa điểm vi phạm cao </w:t>
+      </w:r>
+      <w:proofErr w:type="gramStart"/>
+      <w:r>
+        <w:t>điểm,</w:t>
       </w:r>
       <w:r>
         <w:t>…</w:t>
       </w:r>
+      <w:proofErr w:type="gramEnd"/>
       <w:r>
         <w:t xml:space="preserve"> và gửi thông tin này về các ban quản lý cao hơn</w:t>
       </w:r>
@@ -86,57 +103,621 @@
     <w:p>
       <w:pPr>
         <w:jc w:val="both"/>
-      </w:pPr>
-      <w:r>
+        <w:rPr>
+          <w:b/>
+          <w:bCs/>
+          <w:sz w:val="32"/>
+          <w:szCs w:val="32"/>
+        </w:rPr>
+      </w:pPr>
+      <w:r>
+        <w:rPr>
+          <w:b/>
+          <w:bCs/>
+          <w:sz w:val="32"/>
+          <w:szCs w:val="32"/>
+        </w:rPr>
         <w:t>Mô tả hệ thống</w:t>
       </w:r>
     </w:p>
     <w:p>
       <w:pPr>
-        <w:pStyle w:val="ListParagraph"/>
+        <w:jc w:val="both"/>
+        <w:rPr>
+          <w:lang w:val="vi-VN"/>
+        </w:rPr>
+      </w:pPr>
+      <w:r>
+        <w:rPr>
+          <w:lang w:val="vi-VN"/>
+        </w:rPr>
+        <w:t>Hệ thống gồm hai nền tảng dùng chung một cơ sở dữ liệu SQL Server và trao đổi dữ liệu qua API trung gian:</w:t>
+      </w:r>
+    </w:p>
+    <w:p>
+      <w:pPr>
         <w:numPr>
           <w:ilvl w:val="0"/>
-          <w:numId w:val="1"/>
+          <w:numId w:val="2"/>
         </w:numPr>
         <w:jc w:val="both"/>
-      </w:pPr>
-      <w:r>
-        <w:t xml:space="preserve">Quản lý sinh viên: Phòng công tác sinh viên thực hiện </w:t>
-      </w:r>
-      <w:r>
-        <w:t xml:space="preserve">import file excel </w:t>
-      </w:r>
-      <w:r>
-        <w:t>bao gồm: file thông tin theo khoa, file thông tin quản lý theo khóa và file thông tin sinh viên</w:t>
-      </w:r>
-    </w:p>
-    <w:p>
-      <w:pPr>
-        <w:pStyle w:val="ListParagraph"/>
+        <w:rPr>
+          <w:lang w:val="vi-VN"/>
+        </w:rPr>
+      </w:pPr>
+      <w:r>
+        <w:rPr>
+          <w:b/>
+          <w:bCs/>
+          <w:lang w:val="vi-VN"/>
+        </w:rPr>
+        <w:t>Ứng dụng Desktop</w:t>
+      </w:r>
+      <w:r>
+        <w:rPr>
+          <w:lang w:val="vi-VN"/>
+        </w:rPr>
+        <w:t xml:space="preserve"> đảm nhiệm giám sát camera, phát hiện và ghi nhận vi phạm theo thời gian thực.</w:t>
+      </w:r>
+    </w:p>
+    <w:p>
+      <w:pPr>
         <w:numPr>
           <w:ilvl w:val="0"/>
-          <w:numId w:val="1"/>
+          <w:numId w:val="2"/>
         </w:numPr>
         <w:jc w:val="both"/>
-      </w:pPr>
-      <w:r>
-        <w:t xml:space="preserve">Quản lý vi phạm: Export danh sách </w:t>
-      </w:r>
-      <w:r>
-        <w:t>các sinh viên đã vi phạm tác phong theo khoảng thời gian tuần/tháng/học kì</w:t>
-      </w:r>
-    </w:p>
-    <w:p>
-      <w:pPr>
-        <w:pStyle w:val="ListParagraph"/>
+        <w:rPr>
+          <w:lang w:val="vi-VN"/>
+        </w:rPr>
+      </w:pPr>
+      <w:r>
+        <w:rPr>
+          <w:b/>
+          <w:bCs/>
+          <w:lang w:val="vi-VN"/>
+        </w:rPr>
+        <w:t>Ứng dụng Web</w:t>
+      </w:r>
+      <w:r>
+        <w:rPr>
+          <w:lang w:val="vi-VN"/>
+        </w:rPr>
+        <w:t xml:space="preserve"> dành cho phòng Công tác sinh viên (CTSV), đảm nhiệm quản lý danh mục, quản lý sinh viên, tra cứu vi phạm, thống kê và báo cáo.</w:t>
+      </w:r>
+    </w:p>
+    <w:p>
+      <w:pPr>
+        <w:jc w:val="both"/>
+        <w:rPr>
+          <w:lang w:val="vi-VN"/>
+        </w:rPr>
+      </w:pPr>
+      <w:r>
+        <w:rPr>
+          <w:b/>
+          <w:bCs/>
+          <w:lang w:val="vi-VN"/>
+        </w:rPr>
+        <w:t>1. Quản lý sinh viên (Web)</w:t>
+      </w:r>
+    </w:p>
+    <w:p>
+      <w:pPr>
         <w:numPr>
           <w:ilvl w:val="0"/>
-          <w:numId w:val="1"/>
+          <w:numId w:val="3"/>
         </w:numPr>
         <w:jc w:val="both"/>
-      </w:pPr>
-      <w:r>
-        <w:t xml:space="preserve">Giám sát tác phong: </w:t>
+        <w:rPr>
+          <w:lang w:val="vi-VN"/>
+        </w:rPr>
+      </w:pPr>
+      <w:r>
+        <w:rPr>
+          <w:lang w:val="vi-VN"/>
+        </w:rPr>
+        <w:t>Phòng CTSV thêm, cập nhật, xóa, tra cứu và xem chi tiết thông tin sinh viên.</w:t>
+      </w:r>
+    </w:p>
+    <w:p>
+      <w:pPr>
+        <w:numPr>
+          <w:ilvl w:val="0"/>
+          <w:numId w:val="3"/>
+        </w:numPr>
+        <w:jc w:val="both"/>
+        <w:rPr>
+          <w:lang w:val="vi-VN"/>
+        </w:rPr>
+      </w:pPr>
+      <w:r>
+        <w:rPr>
+          <w:lang w:val="vi-VN"/>
+        </w:rPr>
+        <w:t>Nhập dữ liệu từ file Excel theo thứ tự: file thông tin khoa, file thông tin khóa/lớp, file thông tin sinh viên. Hệ thống kiểm tra dữ liệu, báo dòng lỗi hoặc trùng MSSV trước khi lưu.</w:t>
+      </w:r>
+    </w:p>
+    <w:p>
+      <w:pPr>
+        <w:numPr>
+          <w:ilvl w:val="0"/>
+          <w:numId w:val="3"/>
+        </w:numPr>
+        <w:jc w:val="both"/>
+        <w:rPr>
+          <w:lang w:val="vi-VN"/>
+        </w:rPr>
+      </w:pPr>
+      <w:r>
+        <w:rPr>
+          <w:lang w:val="vi-VN"/>
+        </w:rPr>
+        <w:t>Quản lý danh mục lớp/khoa liên quan đến sinh viên.</w:t>
+      </w:r>
+    </w:p>
+    <w:p>
+      <w:pPr>
+        <w:jc w:val="both"/>
+        <w:rPr>
+          <w:lang w:val="vi-VN"/>
+        </w:rPr>
+      </w:pPr>
+      <w:r>
+        <w:rPr>
+          <w:b/>
+          <w:bCs/>
+          <w:lang w:val="vi-VN"/>
+        </w:rPr>
+        <w:t>2. Giám sát và nhận diện tác phong (Desktop)</w:t>
+      </w:r>
+    </w:p>
+    <w:p>
+      <w:pPr>
+        <w:numPr>
+          <w:ilvl w:val="0"/>
+          <w:numId w:val="4"/>
+        </w:numPr>
+        <w:jc w:val="both"/>
+        <w:rPr>
+          <w:lang w:val="vi-VN"/>
+        </w:rPr>
+      </w:pPr>
+      <w:r>
+        <w:rPr>
+          <w:lang w:val="vi-VN"/>
+        </w:rPr>
+        <w:t>Tiếp nhận hình ảnh/video từ camera đặt tại các khu vực giám sát, hiển thị kết quả theo thời gian thực.</w:t>
+      </w:r>
+    </w:p>
+    <w:p>
+      <w:pPr>
+        <w:numPr>
+          <w:ilvl w:val="0"/>
+          <w:numId w:val="4"/>
+        </w:numPr>
+        <w:jc w:val="both"/>
+        <w:rPr>
+          <w:lang w:val="vi-VN"/>
+        </w:rPr>
+      </w:pPr>
+      <w:r>
+        <w:rPr>
+          <w:lang w:val="vi-VN"/>
+        </w:rPr>
+        <w:lastRenderedPageBreak/>
+        <w:t xml:space="preserve">Phát hiện và theo dõi sinh viên trong khung hình, kiểm tra hai tiêu chí: </w:t>
+      </w:r>
+      <w:r>
+        <w:rPr>
+          <w:b/>
+          <w:bCs/>
+          <w:lang w:val="vi-VN"/>
+        </w:rPr>
+        <w:t>đeo thẻ sinh viên</w:t>
+      </w:r>
+      <w:r>
+        <w:rPr>
+          <w:lang w:val="vi-VN"/>
+        </w:rPr>
+        <w:t xml:space="preserve"> và </w:t>
+      </w:r>
+      <w:r>
+        <w:rPr>
+          <w:b/>
+          <w:bCs/>
+          <w:lang w:val="vi-VN"/>
+        </w:rPr>
+        <w:t>mặc đồng phục</w:t>
+      </w:r>
+      <w:r>
+        <w:rPr>
+          <w:lang w:val="vi-VN"/>
+        </w:rPr>
+        <w:t>. Kết quả được tổng hợp qua nhiều khung hình liên tiếp để giảm dự đoán sai từng khung hình.</w:t>
+      </w:r>
+    </w:p>
+    <w:p>
+      <w:pPr>
+        <w:numPr>
+          <w:ilvl w:val="0"/>
+          <w:numId w:val="4"/>
+        </w:numPr>
+        <w:jc w:val="both"/>
+        <w:rPr>
+          <w:lang w:val="vi-VN"/>
+        </w:rPr>
+      </w:pPr>
+      <w:r>
+        <w:rPr>
+          <w:lang w:val="vi-VN"/>
+        </w:rPr>
+        <w:t>Sinh viên bị xác định vi phạm khi không đeo thẻ nhìn thấy được hoặc không mặc đồng phục, và hệ thống phát cảnh báo ngay trên giao diện giám sát.</w:t>
+      </w:r>
+    </w:p>
+    <w:p>
+      <w:pPr>
+        <w:numPr>
+          <w:ilvl w:val="0"/>
+          <w:numId w:val="4"/>
+        </w:numPr>
+        <w:jc w:val="both"/>
+        <w:rPr>
+          <w:lang w:val="vi-VN"/>
+        </w:rPr>
+      </w:pPr>
+      <w:r>
+        <w:rPr>
+          <w:lang w:val="vi-VN"/>
+        </w:rPr>
+        <w:t>Quản lý danh mục loại vi phạm, tiêu chí đánh giá và khu vực/camera.</w:t>
+      </w:r>
+    </w:p>
+    <w:p>
+      <w:pPr>
+        <w:jc w:val="both"/>
+        <w:rPr>
+          <w:lang w:val="vi-VN"/>
+        </w:rPr>
+      </w:pPr>
+      <w:r>
+        <w:rPr>
+          <w:b/>
+          <w:bCs/>
+          <w:lang w:val="vi-VN"/>
+        </w:rPr>
+        <w:t>3. Ghi nhận vi phạm (Desktop → API → CSDL)</w:t>
+      </w:r>
+    </w:p>
+    <w:p>
+      <w:pPr>
+        <w:numPr>
+          <w:ilvl w:val="0"/>
+          <w:numId w:val="5"/>
+        </w:numPr>
+        <w:jc w:val="both"/>
+        <w:rPr>
+          <w:lang w:val="vi-VN"/>
+        </w:rPr>
+      </w:pPr>
+      <w:r>
+        <w:rPr>
+          <w:lang w:val="vi-VN"/>
+        </w:rPr>
+        <w:t>Khi xác định vi phạm, hệ thống cắt (crop) ảnh người vi phạm làm bằng chứng và gửi lên máy chủ/cloud qua API.</w:t>
+      </w:r>
+    </w:p>
+    <w:p>
+      <w:pPr>
+        <w:numPr>
+          <w:ilvl w:val="0"/>
+          <w:numId w:val="5"/>
+        </w:numPr>
+        <w:jc w:val="both"/>
+        <w:rPr>
+          <w:lang w:val="vi-VN"/>
+        </w:rPr>
+      </w:pPr>
+      <w:r>
+        <w:rPr>
+          <w:lang w:val="vi-VN"/>
+        </w:rPr>
+        <w:t>Mỗi bản ghi lưu: ảnh crop, thời gian ghi nhận, khu vực/camera và loại vi phạm.</w:t>
+      </w:r>
+    </w:p>
+    <w:p>
+      <w:pPr>
+        <w:numPr>
+          <w:ilvl w:val="0"/>
+          <w:numId w:val="5"/>
+        </w:numPr>
+        <w:jc w:val="both"/>
+        <w:rPr>
+          <w:lang w:val="vi-VN"/>
+        </w:rPr>
+      </w:pPr>
+      <w:r>
+        <w:rPr>
+          <w:lang w:val="vi-VN"/>
+        </w:rPr>
+        <w:t xml:space="preserve">Hệ thống </w:t>
+      </w:r>
+      <w:r>
+        <w:rPr>
+          <w:b/>
+          <w:bCs/>
+          <w:lang w:val="vi-VN"/>
+        </w:rPr>
+        <w:t>không nhận diện danh tính</w:t>
+      </w:r>
+      <w:r>
+        <w:rPr>
+          <w:lang w:val="vi-VN"/>
+        </w:rPr>
+        <w:t xml:space="preserve"> sinh viên.</w:t>
+      </w:r>
+    </w:p>
+    <w:p>
+      <w:pPr>
+        <w:numPr>
+          <w:ilvl w:val="0"/>
+          <w:numId w:val="5"/>
+        </w:numPr>
+        <w:jc w:val="both"/>
+        <w:rPr>
+          <w:lang w:val="vi-VN"/>
+        </w:rPr>
+      </w:pPr>
+      <w:r>
+        <w:rPr>
+          <w:b/>
+          <w:bCs/>
+          <w:lang w:val="vi-VN"/>
+        </w:rPr>
+        <w:t>Ảnh được lưu 30 ngày</w:t>
+      </w:r>
+      <w:r>
+        <w:rPr>
+          <w:lang w:val="vi-VN"/>
+        </w:rPr>
+        <w:t xml:space="preserve"> rồi tự động xóa. </w:t>
+      </w:r>
+      <w:r>
+        <w:rPr>
+          <w:b/>
+          <w:bCs/>
+          <w:lang w:val="vi-VN"/>
+        </w:rPr>
+        <w:t>Thông tin vi phạm (thời gian, khu vực, loại vi phạm) vẫn được giữ</w:t>
+      </w:r>
+      <w:r>
+        <w:rPr>
+          <w:lang w:val="vi-VN"/>
+        </w:rPr>
+        <w:t xml:space="preserve"> để phục vụ thống kê và báo cáo.</w:t>
+      </w:r>
+    </w:p>
+    <w:p>
+      <w:pPr>
+        <w:jc w:val="both"/>
+        <w:rPr>
+          <w:lang w:val="vi-VN"/>
+        </w:rPr>
+      </w:pPr>
+      <w:r>
+        <w:rPr>
+          <w:b/>
+          <w:bCs/>
+          <w:lang w:val="vi-VN"/>
+        </w:rPr>
+        <w:t>4. Tra cứu và xử lý vi phạm (Web)</w:t>
+      </w:r>
+    </w:p>
+    <w:p>
+      <w:pPr>
+        <w:numPr>
+          <w:ilvl w:val="0"/>
+          <w:numId w:val="6"/>
+        </w:numPr>
+        <w:jc w:val="both"/>
+        <w:rPr>
+          <w:lang w:val="vi-VN"/>
+        </w:rPr>
+      </w:pPr>
+      <w:r>
+        <w:rPr>
+          <w:lang w:val="vi-VN"/>
+        </w:rPr>
+        <w:t>Nhân viên CTSV đăng nhập và xem danh sách vi phạm kèm ảnh crop. Có thể lọc theo thời gian, khu vực/camera, loại vi phạm và xem chi tiết từng bản ghi.</w:t>
+      </w:r>
+    </w:p>
+    <w:p>
+      <w:pPr>
+        <w:numPr>
+          <w:ilvl w:val="0"/>
+          <w:numId w:val="6"/>
+        </w:numPr>
+        <w:jc w:val="both"/>
+        <w:rPr>
+          <w:lang w:val="vi-VN"/>
+        </w:rPr>
+      </w:pPr>
+      <w:r>
+        <w:rPr>
+          <w:lang w:val="vi-VN"/>
+        </w:rPr>
+        <w:t>Việc đối chiếu danh tính và trừ điểm rèn luyện do phòng CTSV tự thực hiện theo quy định hiện hành, ngoài hệ thống.</w:t>
+      </w:r>
+    </w:p>
+    <w:p>
+      <w:pPr>
+        <w:jc w:val="both"/>
+        <w:rPr>
+          <w:lang w:val="vi-VN"/>
+        </w:rPr>
+      </w:pPr>
+      <w:r>
+        <w:rPr>
+          <w:b/>
+          <w:bCs/>
+          <w:lang w:val="vi-VN"/>
+        </w:rPr>
+        <w:t>5. Thống kê và báo cáo (Web)</w:t>
+      </w:r>
+    </w:p>
+    <w:p>
+      <w:pPr>
+        <w:numPr>
+          <w:ilvl w:val="0"/>
+          <w:numId w:val="7"/>
+        </w:numPr>
+        <w:jc w:val="both"/>
+        <w:rPr>
+          <w:lang w:val="vi-VN"/>
+        </w:rPr>
+      </w:pPr>
+      <w:r>
+        <w:rPr>
+          <w:lang w:val="vi-VN"/>
+        </w:rPr>
+        <w:t>Thống kê số lượng vi phạm theo thời gian (tuần/tháng/học kỳ), theo khung giờ và khu vực thường xảy ra vi phạm, theo loại vi phạm, hiển thị bằng biểu đồ trực quan.</w:t>
+      </w:r>
+    </w:p>
+    <w:p>
+      <w:pPr>
+        <w:numPr>
+          <w:ilvl w:val="0"/>
+          <w:numId w:val="7"/>
+        </w:numPr>
+        <w:jc w:val="both"/>
+        <w:rPr>
+          <w:lang w:val="vi-VN"/>
+        </w:rPr>
+      </w:pPr>
+      <w:r>
+        <w:rPr>
+          <w:lang w:val="vi-VN"/>
+        </w:rPr>
+        <w:t xml:space="preserve">Kết xuất báo cáo dưới dạng </w:t>
+      </w:r>
+      <w:r>
+        <w:rPr>
+          <w:b/>
+          <w:bCs/>
+          <w:lang w:val="vi-VN"/>
+        </w:rPr>
+        <w:t>Excel/PDF</w:t>
+      </w:r>
+      <w:r>
+        <w:rPr>
+          <w:lang w:val="vi-VN"/>
+        </w:rPr>
+        <w:t xml:space="preserve"> để gửi lên các ban quản lý cấp cao hơn.</w:t>
+      </w:r>
+    </w:p>
+    <w:p>
+      <w:pPr>
+        <w:jc w:val="both"/>
+        <w:rPr>
+          <w:lang w:val="vi-VN"/>
+        </w:rPr>
+      </w:pPr>
+      <w:r>
+        <w:rPr>
+          <w:b/>
+          <w:bCs/>
+          <w:lang w:val="vi-VN"/>
+        </w:rPr>
+        <w:t>6. Quản lý tài khoản và phân quyền (Web)</w:t>
+      </w:r>
+    </w:p>
+    <w:p>
+      <w:pPr>
+        <w:numPr>
+          <w:ilvl w:val="0"/>
+          <w:numId w:val="8"/>
+        </w:numPr>
+        <w:jc w:val="both"/>
+        <w:rPr>
+          <w:lang w:val="vi-VN"/>
+        </w:rPr>
+      </w:pPr>
+      <w:r>
+        <w:rPr>
+          <w:lang w:val="vi-VN"/>
+        </w:rPr>
+        <w:t>Đăng nhập, đăng xuất, đổi mật khẩu.</w:t>
+      </w:r>
+    </w:p>
+    <w:p>
+      <w:pPr>
+        <w:numPr>
+          <w:ilvl w:val="0"/>
+          <w:numId w:val="8"/>
+        </w:numPr>
+        <w:jc w:val="both"/>
+        <w:rPr>
+          <w:lang w:val="vi-VN"/>
+        </w:rPr>
+      </w:pPr>
+      <w:r>
+        <w:rPr>
+          <w:lang w:val="vi-VN"/>
+        </w:rPr>
+        <w:t>Quản lý tài khoản và phân quyền theo vai trò (Quản trị viên, Nhân viên CTSV), kiểm soát quyền truy cập từng chức năng.</w:t>
+      </w:r>
+    </w:p>
+    <w:p>
+      <w:pPr>
+        <w:jc w:val="both"/>
+        <w:rPr>
+          <w:lang w:val="vi-VN"/>
+        </w:rPr>
+      </w:pPr>
+      <w:r>
+        <w:rPr>
+          <w:b/>
+          <w:bCs/>
+          <w:lang w:val="vi-VN"/>
+        </w:rPr>
+        <w:lastRenderedPageBreak/>
+        <w:t>7. Tích hợp và trao đổi dữ liệu</w:t>
+      </w:r>
+    </w:p>
+    <w:p>
+      <w:pPr>
+        <w:numPr>
+          <w:ilvl w:val="0"/>
+          <w:numId w:val="9"/>
+        </w:numPr>
+        <w:jc w:val="both"/>
+        <w:rPr>
+          <w:lang w:val="vi-VN"/>
+        </w:rPr>
+      </w:pPr>
+      <w:r>
+        <w:rPr>
+          <w:lang w:val="vi-VN"/>
+        </w:rPr>
+        <w:t>API trung gian kết nối Desktop và Web.</w:t>
+      </w:r>
+    </w:p>
+    <w:p>
+      <w:pPr>
+        <w:numPr>
+          <w:ilvl w:val="0"/>
+          <w:numId w:val="9"/>
+        </w:numPr>
+        <w:jc w:val="both"/>
+        <w:rPr>
+          <w:lang w:val="vi-VN"/>
+        </w:rPr>
+      </w:pPr>
+      <w:r>
+        <w:rPr>
+          <w:lang w:val="vi-VN"/>
+        </w:rPr>
+        <w:t>Dữ liệu vi phạm và danh mục dùng chung (loại vi phạm, khu vực/camera, lớp/khoa) được đồng bộ nhất quán giữa hai nền tảng.</w:t>
       </w:r>
     </w:p>
     <w:p>
@@ -157,6 +738,602 @@
 <file path=word/numbering.xml><?xml version="1.0" encoding="utf-8"?>
 <w:numbering xmlns:wpc="http://schemas.microsoft.com/office/word/2010/wordprocessingCanvas" xmlns:cx="http://schemas.microsoft.com/office/drawing/2014/chartex" xmlns:cx1="http://schemas.microsoft.com/office/drawing/2015/9/8/chartex" xmlns:cx2="http://schemas.microsoft.com/office/drawing/2015/10/21/chartex" xmlns:cx3="http://schemas.microsoft.com/office/drawing/2016/5/9/chartex" xmlns:cx4="http://schemas.microsoft.com/office/drawing/2016/5/10/chartex" xmlns:cx5="http://schemas.microsoft.com/office/drawing/2016/5/11/chartex" xmlns:cx6="http://schemas.microsoft.com/office/drawing/2016/5/12/chartex" xmlns:cx7="http://schemas.microsoft.com/office/drawing/2016/5/13/chartex" xmlns:cx8="http://schemas.microsoft.com/office/drawing/2016/5/14/chartex" xmlns:mc="http://schemas.openxmlformats.org/markup-compatibility/2006" xmlns:aink="http://schemas.microsoft.com/office/drawing/2016/ink" xmlns:am3d="http://schemas.microsoft.com/office/drawing/2017/model3d" xmlns:o="urn:schemas-microsoft-com:office:office" xmlns:oel="http://schemas.microsoft.com/office/2019/extlst" xmlns:r="http://schemas.openxmlformats.org/officeDocument/2006/relationships" xmlns:m="http://schemas.openxmlformats.org/officeDocument/2006/math" xmlns:v="urn:schemas-microsoft-com:vml" xmlns:wp14="http://schemas.microsoft.com/office/word/2010/wordprocessingDrawing" xmlns:wp="http://schemas.openxmlformats.org/drawingml/2006/wordprocessingDrawing" xmlns:w10="urn:schemas-microsoft-com:office:word" xmlns:w="http://schemas.openxmlformats.org/wordprocessingml/2006/main" xmlns:w14="http://schemas.microsoft.com/office/word/2010/wordml" xmlns:w15="http://schemas.microsoft.com/office/word/2012/wordml" xmlns:w16cex="http://schemas.microsoft.com/office/word/2018/wordml/cex" xmlns:w16cid="http://schemas.microsoft.com/office/word/2016/wordml/cid" xmlns:w16="http://schemas.microsoft.com/office/word/2018/wordml" xmlns:w16du="http://schemas.microsoft.com/office/word/2023/wordml/word16du" xmlns:w16sdtdh="http://schemas.microsoft.com/office/word/2020/wordml/sdtdatahash" xmlns:w16sdtfl="http://schemas.microsoft.com/office/word/2024/wordml/sdtformatlock" xmlns:w16se="http://schemas.microsoft.com/office/word/2015/wordml/symex" xmlns:wpg="http://schemas.microsoft.com/office/word/2010/wordprocessingGroup" xmlns:wpi="http://schemas.microsoft.com/office/word/2010/wordprocessingInk" xmlns:wne="http://schemas.microsoft.com/office/word/2006/wordml" xmlns:wps="http://schemas.microsoft.com/office/word/2010/wordprocessingShape" mc:Ignorable="w14 w15 w16se w16cid w16 w16cex w16sdtdh w16sdtfl w16du wp14">
   <w:abstractNum w:abstractNumId="0" w15:restartNumberingAfterBreak="0">
+    <w:nsid w:val="1EF41E5E"/>
+    <w:multiLevelType w:val="multilevel"/>
+    <w:tmpl w:val="7C10CF1A"/>
+    <w:lvl w:ilvl="0">
+      <w:start w:val="1"/>
+      <w:numFmt w:val="bullet"/>
+      <w:lvlText w:val=""/>
+      <w:lvlJc w:val="left"/>
+      <w:pPr>
+        <w:tabs>
+          <w:tab w:val="num" w:pos="720"/>
+        </w:tabs>
+        <w:ind w:left="720" w:hanging="360"/>
+      </w:pPr>
+      <w:rPr>
+        <w:rFonts w:ascii="Symbol" w:hAnsi="Symbol" w:hint="default"/>
+        <w:sz w:val="20"/>
+      </w:rPr>
+    </w:lvl>
+    <w:lvl w:ilvl="1" w:tentative="1">
+      <w:start w:val="1"/>
+      <w:numFmt w:val="bullet"/>
+      <w:lvlText w:val="o"/>
+      <w:lvlJc w:val="left"/>
+      <w:pPr>
+        <w:tabs>
+          <w:tab w:val="num" w:pos="1440"/>
+        </w:tabs>
+        <w:ind w:left="1440" w:hanging="360"/>
+      </w:pPr>
+      <w:rPr>
+        <w:rFonts w:ascii="Courier New" w:hAnsi="Courier New" w:hint="default"/>
+        <w:sz w:val="20"/>
+      </w:rPr>
+    </w:lvl>
+    <w:lvl w:ilvl="2" w:tentative="1">
+      <w:start w:val="1"/>
+      <w:numFmt w:val="bullet"/>
+      <w:lvlText w:val=""/>
+      <w:lvlJc w:val="left"/>
+      <w:pPr>
+        <w:tabs>
+          <w:tab w:val="num" w:pos="2160"/>
+        </w:tabs>
+        <w:ind w:left="2160" w:hanging="360"/>
+      </w:pPr>
+      <w:rPr>
+        <w:rFonts w:ascii="Wingdings" w:hAnsi="Wingdings" w:hint="default"/>
+        <w:sz w:val="20"/>
+      </w:rPr>
+    </w:lvl>
+    <w:lvl w:ilvl="3" w:tentative="1">
+      <w:start w:val="1"/>
+      <w:numFmt w:val="bullet"/>
+      <w:lvlText w:val=""/>
+      <w:lvlJc w:val="left"/>
+      <w:pPr>
+        <w:tabs>
+          <w:tab w:val="num" w:pos="2880"/>
+        </w:tabs>
+        <w:ind w:left="2880" w:hanging="360"/>
+      </w:pPr>
+      <w:rPr>
+        <w:rFonts w:ascii="Wingdings" w:hAnsi="Wingdings" w:hint="default"/>
+        <w:sz w:val="20"/>
+      </w:rPr>
+    </w:lvl>
+    <w:lvl w:ilvl="4" w:tentative="1">
+      <w:start w:val="1"/>
+      <w:numFmt w:val="bullet"/>
+      <w:lvlText w:val=""/>
+      <w:lvlJc w:val="left"/>
+      <w:pPr>
+        <w:tabs>
+          <w:tab w:val="num" w:pos="3600"/>
+        </w:tabs>
+        <w:ind w:left="3600" w:hanging="360"/>
+      </w:pPr>
+      <w:rPr>
+        <w:rFonts w:ascii="Wingdings" w:hAnsi="Wingdings" w:hint="default"/>
+        <w:sz w:val="20"/>
+      </w:rPr>
+    </w:lvl>
+    <w:lvl w:ilvl="5" w:tentative="1">
+      <w:start w:val="1"/>
+      <w:numFmt w:val="bullet"/>
+      <w:lvlText w:val=""/>
+      <w:lvlJc w:val="left"/>
+      <w:pPr>
+        <w:tabs>
+          <w:tab w:val="num" w:pos="4320"/>
+        </w:tabs>
+        <w:ind w:left="4320" w:hanging="360"/>
+      </w:pPr>
+      <w:rPr>
+        <w:rFonts w:ascii="Wingdings" w:hAnsi="Wingdings" w:hint="default"/>
+        <w:sz w:val="20"/>
+      </w:rPr>
+    </w:lvl>
+    <w:lvl w:ilvl="6" w:tentative="1">
+      <w:start w:val="1"/>
+      <w:numFmt w:val="bullet"/>
+      <w:lvlText w:val=""/>
+      <w:lvlJc w:val="left"/>
+      <w:pPr>
+        <w:tabs>
+          <w:tab w:val="num" w:pos="5040"/>
+        </w:tabs>
+        <w:ind w:left="5040" w:hanging="360"/>
+      </w:pPr>
+      <w:rPr>
+        <w:rFonts w:ascii="Wingdings" w:hAnsi="Wingdings" w:hint="default"/>
+        <w:sz w:val="20"/>
+      </w:rPr>
+    </w:lvl>
+    <w:lvl w:ilvl="7" w:tentative="1">
+      <w:start w:val="1"/>
+      <w:numFmt w:val="bullet"/>
+      <w:lvlText w:val=""/>
+      <w:lvlJc w:val="left"/>
+      <w:pPr>
+        <w:tabs>
+          <w:tab w:val="num" w:pos="5760"/>
+        </w:tabs>
+        <w:ind w:left="5760" w:hanging="360"/>
+      </w:pPr>
+      <w:rPr>
+        <w:rFonts w:ascii="Wingdings" w:hAnsi="Wingdings" w:hint="default"/>
+        <w:sz w:val="20"/>
+      </w:rPr>
+    </w:lvl>
+    <w:lvl w:ilvl="8" w:tentative="1">
+      <w:start w:val="1"/>
+      <w:numFmt w:val="bullet"/>
+      <w:lvlText w:val=""/>
+      <w:lvlJc w:val="left"/>
+      <w:pPr>
+        <w:tabs>
+          <w:tab w:val="num" w:pos="6480"/>
+        </w:tabs>
+        <w:ind w:left="6480" w:hanging="360"/>
+      </w:pPr>
+      <w:rPr>
+        <w:rFonts w:ascii="Wingdings" w:hAnsi="Wingdings" w:hint="default"/>
+        <w:sz w:val="20"/>
+      </w:rPr>
+    </w:lvl>
+  </w:abstractNum>
+  <w:abstractNum w:abstractNumId="1" w15:restartNumberingAfterBreak="0">
+    <w:nsid w:val="25A96CC9"/>
+    <w:multiLevelType w:val="multilevel"/>
+    <w:tmpl w:val="5566B43A"/>
+    <w:lvl w:ilvl="0">
+      <w:start w:val="1"/>
+      <w:numFmt w:val="bullet"/>
+      <w:lvlText w:val=""/>
+      <w:lvlJc w:val="left"/>
+      <w:pPr>
+        <w:tabs>
+          <w:tab w:val="num" w:pos="720"/>
+        </w:tabs>
+        <w:ind w:left="720" w:hanging="360"/>
+      </w:pPr>
+      <w:rPr>
+        <w:rFonts w:ascii="Symbol" w:hAnsi="Symbol" w:hint="default"/>
+        <w:sz w:val="20"/>
+      </w:rPr>
+    </w:lvl>
+    <w:lvl w:ilvl="1" w:tentative="1">
+      <w:start w:val="1"/>
+      <w:numFmt w:val="bullet"/>
+      <w:lvlText w:val="o"/>
+      <w:lvlJc w:val="left"/>
+      <w:pPr>
+        <w:tabs>
+          <w:tab w:val="num" w:pos="1440"/>
+        </w:tabs>
+        <w:ind w:left="1440" w:hanging="360"/>
+      </w:pPr>
+      <w:rPr>
+        <w:rFonts w:ascii="Courier New" w:hAnsi="Courier New" w:hint="default"/>
+        <w:sz w:val="20"/>
+      </w:rPr>
+    </w:lvl>
+    <w:lvl w:ilvl="2" w:tentative="1">
+      <w:start w:val="1"/>
+      <w:numFmt w:val="bullet"/>
+      <w:lvlText w:val=""/>
+      <w:lvlJc w:val="left"/>
+      <w:pPr>
+        <w:tabs>
+          <w:tab w:val="num" w:pos="2160"/>
+        </w:tabs>
+        <w:ind w:left="2160" w:hanging="360"/>
+      </w:pPr>
+      <w:rPr>
+        <w:rFonts w:ascii="Wingdings" w:hAnsi="Wingdings" w:hint="default"/>
+        <w:sz w:val="20"/>
+      </w:rPr>
+    </w:lvl>
+    <w:lvl w:ilvl="3" w:tentative="1">
+      <w:start w:val="1"/>
+      <w:numFmt w:val="bullet"/>
+      <w:lvlText w:val=""/>
+      <w:lvlJc w:val="left"/>
+      <w:pPr>
+        <w:tabs>
+          <w:tab w:val="num" w:pos="2880"/>
+        </w:tabs>
+        <w:ind w:left="2880" w:hanging="360"/>
+      </w:pPr>
+      <w:rPr>
+        <w:rFonts w:ascii="Wingdings" w:hAnsi="Wingdings" w:hint="default"/>
+        <w:sz w:val="20"/>
+      </w:rPr>
+    </w:lvl>
+    <w:lvl w:ilvl="4" w:tentative="1">
+      <w:start w:val="1"/>
+      <w:numFmt w:val="bullet"/>
+      <w:lvlText w:val=""/>
+      <w:lvlJc w:val="left"/>
+      <w:pPr>
+        <w:tabs>
+          <w:tab w:val="num" w:pos="3600"/>
+        </w:tabs>
+        <w:ind w:left="3600" w:hanging="360"/>
+      </w:pPr>
+      <w:rPr>
+        <w:rFonts w:ascii="Wingdings" w:hAnsi="Wingdings" w:hint="default"/>
+        <w:sz w:val="20"/>
+      </w:rPr>
+    </w:lvl>
+    <w:lvl w:ilvl="5" w:tentative="1">
+      <w:start w:val="1"/>
+      <w:numFmt w:val="bullet"/>
+      <w:lvlText w:val=""/>
+      <w:lvlJc w:val="left"/>
+      <w:pPr>
+        <w:tabs>
+          <w:tab w:val="num" w:pos="4320"/>
+        </w:tabs>
+        <w:ind w:left="4320" w:hanging="360"/>
+      </w:pPr>
+      <w:rPr>
+        <w:rFonts w:ascii="Wingdings" w:hAnsi="Wingdings" w:hint="default"/>
+        <w:sz w:val="20"/>
+      </w:rPr>
+    </w:lvl>
+    <w:lvl w:ilvl="6" w:tentative="1">
+      <w:start w:val="1"/>
+      <w:numFmt w:val="bullet"/>
+      <w:lvlText w:val=""/>
+      <w:lvlJc w:val="left"/>
+      <w:pPr>
+        <w:tabs>
+          <w:tab w:val="num" w:pos="5040"/>
+        </w:tabs>
+        <w:ind w:left="5040" w:hanging="360"/>
+      </w:pPr>
+      <w:rPr>
+        <w:rFonts w:ascii="Wingdings" w:hAnsi="Wingdings" w:hint="default"/>
+        <w:sz w:val="20"/>
+      </w:rPr>
+    </w:lvl>
+    <w:lvl w:ilvl="7" w:tentative="1">
+      <w:start w:val="1"/>
+      <w:numFmt w:val="bullet"/>
+      <w:lvlText w:val=""/>
+      <w:lvlJc w:val="left"/>
+      <w:pPr>
+        <w:tabs>
+          <w:tab w:val="num" w:pos="5760"/>
+        </w:tabs>
+        <w:ind w:left="5760" w:hanging="360"/>
+      </w:pPr>
+      <w:rPr>
+        <w:rFonts w:ascii="Wingdings" w:hAnsi="Wingdings" w:hint="default"/>
+        <w:sz w:val="20"/>
+      </w:rPr>
+    </w:lvl>
+    <w:lvl w:ilvl="8" w:tentative="1">
+      <w:start w:val="1"/>
+      <w:numFmt w:val="bullet"/>
+      <w:lvlText w:val=""/>
+      <w:lvlJc w:val="left"/>
+      <w:pPr>
+        <w:tabs>
+          <w:tab w:val="num" w:pos="6480"/>
+        </w:tabs>
+        <w:ind w:left="6480" w:hanging="360"/>
+      </w:pPr>
+      <w:rPr>
+        <w:rFonts w:ascii="Wingdings" w:hAnsi="Wingdings" w:hint="default"/>
+        <w:sz w:val="20"/>
+      </w:rPr>
+    </w:lvl>
+  </w:abstractNum>
+  <w:abstractNum w:abstractNumId="2" w15:restartNumberingAfterBreak="0">
+    <w:nsid w:val="290F6CFB"/>
+    <w:multiLevelType w:val="multilevel"/>
+    <w:tmpl w:val="2D6255A6"/>
+    <w:lvl w:ilvl="0">
+      <w:start w:val="1"/>
+      <w:numFmt w:val="bullet"/>
+      <w:lvlText w:val=""/>
+      <w:lvlJc w:val="left"/>
+      <w:pPr>
+        <w:tabs>
+          <w:tab w:val="num" w:pos="720"/>
+        </w:tabs>
+        <w:ind w:left="720" w:hanging="360"/>
+      </w:pPr>
+      <w:rPr>
+        <w:rFonts w:ascii="Symbol" w:hAnsi="Symbol" w:hint="default"/>
+        <w:sz w:val="20"/>
+      </w:rPr>
+    </w:lvl>
+    <w:lvl w:ilvl="1" w:tentative="1">
+      <w:start w:val="1"/>
+      <w:numFmt w:val="bullet"/>
+      <w:lvlText w:val="o"/>
+      <w:lvlJc w:val="left"/>
+      <w:pPr>
+        <w:tabs>
+          <w:tab w:val="num" w:pos="1440"/>
+        </w:tabs>
+        <w:ind w:left="1440" w:hanging="360"/>
+      </w:pPr>
+      <w:rPr>
+        <w:rFonts w:ascii="Courier New" w:hAnsi="Courier New" w:hint="default"/>
+        <w:sz w:val="20"/>
+      </w:rPr>
+    </w:lvl>
+    <w:lvl w:ilvl="2" w:tentative="1">
+      <w:start w:val="1"/>
+      <w:numFmt w:val="bullet"/>
+      <w:lvlText w:val=""/>
+      <w:lvlJc w:val="left"/>
+      <w:pPr>
+        <w:tabs>
+          <w:tab w:val="num" w:pos="2160"/>
+        </w:tabs>
+        <w:ind w:left="2160" w:hanging="360"/>
+      </w:pPr>
+      <w:rPr>
+        <w:rFonts w:ascii="Wingdings" w:hAnsi="Wingdings" w:hint="default"/>
+        <w:sz w:val="20"/>
+      </w:rPr>
+    </w:lvl>
+    <w:lvl w:ilvl="3" w:tentative="1">
+      <w:start w:val="1"/>
+      <w:numFmt w:val="bullet"/>
+      <w:lvlText w:val=""/>
+      <w:lvlJc w:val="left"/>
+      <w:pPr>
+        <w:tabs>
+          <w:tab w:val="num" w:pos="2880"/>
+        </w:tabs>
+        <w:ind w:left="2880" w:hanging="360"/>
+      </w:pPr>
+      <w:rPr>
+        <w:rFonts w:ascii="Wingdings" w:hAnsi="Wingdings" w:hint="default"/>
+        <w:sz w:val="20"/>
+      </w:rPr>
+    </w:lvl>
+    <w:lvl w:ilvl="4" w:tentative="1">
+      <w:start w:val="1"/>
+      <w:numFmt w:val="bullet"/>
+      <w:lvlText w:val=""/>
+      <w:lvlJc w:val="left"/>
+      <w:pPr>
+        <w:tabs>
+          <w:tab w:val="num" w:pos="3600"/>
+        </w:tabs>
+        <w:ind w:left="3600" w:hanging="360"/>
+      </w:pPr>
+      <w:rPr>
+        <w:rFonts w:ascii="Wingdings" w:hAnsi="Wingdings" w:hint="default"/>
+        <w:sz w:val="20"/>
+      </w:rPr>
+    </w:lvl>
+    <w:lvl w:ilvl="5" w:tentative="1">
+      <w:start w:val="1"/>
+      <w:numFmt w:val="bullet"/>
+      <w:lvlText w:val=""/>
+      <w:lvlJc w:val="left"/>
+      <w:pPr>
+        <w:tabs>
+          <w:tab w:val="num" w:pos="4320"/>
+        </w:tabs>
+        <w:ind w:left="4320" w:hanging="360"/>
+      </w:pPr>
+      <w:rPr>
+        <w:rFonts w:ascii="Wingdings" w:hAnsi="Wingdings" w:hint="default"/>
+        <w:sz w:val="20"/>
+      </w:rPr>
+    </w:lvl>
+    <w:lvl w:ilvl="6" w:tentative="1">
+      <w:start w:val="1"/>
+      <w:numFmt w:val="bullet"/>
+      <w:lvlText w:val=""/>
+      <w:lvlJc w:val="left"/>
+      <w:pPr>
+        <w:tabs>
+          <w:tab w:val="num" w:pos="5040"/>
+        </w:tabs>
+        <w:ind w:left="5040" w:hanging="360"/>
+      </w:pPr>
+      <w:rPr>
+        <w:rFonts w:ascii="Wingdings" w:hAnsi="Wingdings" w:hint="default"/>
+        <w:sz w:val="20"/>
+      </w:rPr>
+    </w:lvl>
+    <w:lvl w:ilvl="7" w:tentative="1">
+      <w:start w:val="1"/>
+      <w:numFmt w:val="bullet"/>
+      <w:lvlText w:val=""/>
+      <w:lvlJc w:val="left"/>
+      <w:pPr>
+        <w:tabs>
+          <w:tab w:val="num" w:pos="5760"/>
+        </w:tabs>
+        <w:ind w:left="5760" w:hanging="360"/>
+      </w:pPr>
+      <w:rPr>
+        <w:rFonts w:ascii="Wingdings" w:hAnsi="Wingdings" w:hint="default"/>
+        <w:sz w:val="20"/>
+      </w:rPr>
+    </w:lvl>
+    <w:lvl w:ilvl="8" w:tentative="1">
+      <w:start w:val="1"/>
+      <w:numFmt w:val="bullet"/>
+      <w:lvlText w:val=""/>
+      <w:lvlJc w:val="left"/>
+      <w:pPr>
+        <w:tabs>
+          <w:tab w:val="num" w:pos="6480"/>
+        </w:tabs>
+        <w:ind w:left="6480" w:hanging="360"/>
+      </w:pPr>
+      <w:rPr>
+        <w:rFonts w:ascii="Wingdings" w:hAnsi="Wingdings" w:hint="default"/>
+        <w:sz w:val="20"/>
+      </w:rPr>
+    </w:lvl>
+  </w:abstractNum>
+  <w:abstractNum w:abstractNumId="3" w15:restartNumberingAfterBreak="0">
+    <w:nsid w:val="4FD85511"/>
+    <w:multiLevelType w:val="multilevel"/>
+    <w:tmpl w:val="5A7EE5F0"/>
+    <w:lvl w:ilvl="0">
+      <w:start w:val="1"/>
+      <w:numFmt w:val="bullet"/>
+      <w:lvlText w:val=""/>
+      <w:lvlJc w:val="left"/>
+      <w:pPr>
+        <w:tabs>
+          <w:tab w:val="num" w:pos="720"/>
+        </w:tabs>
+        <w:ind w:left="720" w:hanging="360"/>
+      </w:pPr>
+      <w:rPr>
+        <w:rFonts w:ascii="Symbol" w:hAnsi="Symbol" w:hint="default"/>
+        <w:sz w:val="20"/>
+      </w:rPr>
+    </w:lvl>
+    <w:lvl w:ilvl="1" w:tentative="1">
+      <w:start w:val="1"/>
+      <w:numFmt w:val="bullet"/>
+      <w:lvlText w:val="o"/>
+      <w:lvlJc w:val="left"/>
+      <w:pPr>
+        <w:tabs>
+          <w:tab w:val="num" w:pos="1440"/>
+        </w:tabs>
+        <w:ind w:left="1440" w:hanging="360"/>
+      </w:pPr>
+      <w:rPr>
+        <w:rFonts w:ascii="Courier New" w:hAnsi="Courier New" w:hint="default"/>
+        <w:sz w:val="20"/>
+      </w:rPr>
+    </w:lvl>
+    <w:lvl w:ilvl="2" w:tentative="1">
+      <w:start w:val="1"/>
+      <w:numFmt w:val="bullet"/>
+      <w:lvlText w:val=""/>
+      <w:lvlJc w:val="left"/>
+      <w:pPr>
+        <w:tabs>
+          <w:tab w:val="num" w:pos="2160"/>
+        </w:tabs>
+        <w:ind w:left="2160" w:hanging="360"/>
+      </w:pPr>
+      <w:rPr>
+        <w:rFonts w:ascii="Wingdings" w:hAnsi="Wingdings" w:hint="default"/>
+        <w:sz w:val="20"/>
+      </w:rPr>
+    </w:lvl>
+    <w:lvl w:ilvl="3" w:tentative="1">
+      <w:start w:val="1"/>
+      <w:numFmt w:val="bullet"/>
+      <w:lvlText w:val=""/>
+      <w:lvlJc w:val="left"/>
+      <w:pPr>
+        <w:tabs>
+          <w:tab w:val="num" w:pos="2880"/>
+        </w:tabs>
+        <w:ind w:left="2880" w:hanging="360"/>
+      </w:pPr>
+      <w:rPr>
+        <w:rFonts w:ascii="Wingdings" w:hAnsi="Wingdings" w:hint="default"/>
+        <w:sz w:val="20"/>
+      </w:rPr>
+    </w:lvl>
+    <w:lvl w:ilvl="4" w:tentative="1">
+      <w:start w:val="1"/>
+      <w:numFmt w:val="bullet"/>
+      <w:lvlText w:val=""/>
+      <w:lvlJc w:val="left"/>
+      <w:pPr>
+        <w:tabs>
+          <w:tab w:val="num" w:pos="3600"/>
+        </w:tabs>
+        <w:ind w:left="3600" w:hanging="360"/>
+      </w:pPr>
+      <w:rPr>
+        <w:rFonts w:ascii="Wingdings" w:hAnsi="Wingdings" w:hint="default"/>
+        <w:sz w:val="20"/>
+      </w:rPr>
+    </w:lvl>
+    <w:lvl w:ilvl="5" w:tentative="1">
+      <w:start w:val="1"/>
+      <w:numFmt w:val="bullet"/>
+      <w:lvlText w:val=""/>
+      <w:lvlJc w:val="left"/>
+      <w:pPr>
+        <w:tabs>
+          <w:tab w:val="num" w:pos="4320"/>
+        </w:tabs>
+        <w:ind w:left="4320" w:hanging="360"/>
+      </w:pPr>
+      <w:rPr>
+        <w:rFonts w:ascii="Wingdings" w:hAnsi="Wingdings" w:hint="default"/>
+        <w:sz w:val="20"/>
+      </w:rPr>
+    </w:lvl>
+    <w:lvl w:ilvl="6" w:tentative="1">
+      <w:start w:val="1"/>
+      <w:numFmt w:val="bullet"/>
+      <w:lvlText w:val=""/>
+      <w:lvlJc w:val="left"/>
+      <w:pPr>
+        <w:tabs>
+          <w:tab w:val="num" w:pos="5040"/>
+        </w:tabs>
+        <w:ind w:left="5040" w:hanging="360"/>
+      </w:pPr>
+      <w:rPr>
+        <w:rFonts w:ascii="Wingdings" w:hAnsi="Wingdings" w:hint="default"/>
+        <w:sz w:val="20"/>
+      </w:rPr>
+    </w:lvl>
+    <w:lvl w:ilvl="7" w:tentative="1">
+      <w:start w:val="1"/>
+      <w:numFmt w:val="bullet"/>
+      <w:lvlText w:val=""/>
+      <w:lvlJc w:val="left"/>
+      <w:pPr>
+        <w:tabs>
+          <w:tab w:val="num" w:pos="5760"/>
+        </w:tabs>
+        <w:ind w:left="5760" w:hanging="360"/>
+      </w:pPr>
+      <w:rPr>
+        <w:rFonts w:ascii="Wingdings" w:hAnsi="Wingdings" w:hint="default"/>
+        <w:sz w:val="20"/>
+      </w:rPr>
+    </w:lvl>
+    <w:lvl w:ilvl="8" w:tentative="1">
+      <w:start w:val="1"/>
+      <w:numFmt w:val="bullet"/>
+      <w:lvlText w:val=""/>
+      <w:lvlJc w:val="left"/>
+      <w:pPr>
+        <w:tabs>
+          <w:tab w:val="num" w:pos="6480"/>
+        </w:tabs>
+        <w:ind w:left="6480" w:hanging="360"/>
+      </w:pPr>
+      <w:rPr>
+        <w:rFonts w:ascii="Wingdings" w:hAnsi="Wingdings" w:hint="default"/>
+        <w:sz w:val="20"/>
+      </w:rPr>
+    </w:lvl>
+  </w:abstractNum>
+  <w:abstractNum w:abstractNumId="4" w15:restartNumberingAfterBreak="0">
     <w:nsid w:val="578007D0"/>
     <w:multiLevelType w:val="hybridMultilevel"/>
     <w:tmpl w:val="ADA293C0"/>
@@ -268,8 +1445,628 @@
       </w:rPr>
     </w:lvl>
   </w:abstractNum>
+  <w:abstractNum w:abstractNumId="5" w15:restartNumberingAfterBreak="0">
+    <w:nsid w:val="5CEB622B"/>
+    <w:multiLevelType w:val="multilevel"/>
+    <w:tmpl w:val="CA2C7A9E"/>
+    <w:lvl w:ilvl="0">
+      <w:start w:val="1"/>
+      <w:numFmt w:val="bullet"/>
+      <w:lvlText w:val=""/>
+      <w:lvlJc w:val="left"/>
+      <w:pPr>
+        <w:tabs>
+          <w:tab w:val="num" w:pos="720"/>
+        </w:tabs>
+        <w:ind w:left="720" w:hanging="360"/>
+      </w:pPr>
+      <w:rPr>
+        <w:rFonts w:ascii="Symbol" w:hAnsi="Symbol" w:hint="default"/>
+        <w:sz w:val="20"/>
+      </w:rPr>
+    </w:lvl>
+    <w:lvl w:ilvl="1" w:tentative="1">
+      <w:start w:val="1"/>
+      <w:numFmt w:val="bullet"/>
+      <w:lvlText w:val="o"/>
+      <w:lvlJc w:val="left"/>
+      <w:pPr>
+        <w:tabs>
+          <w:tab w:val="num" w:pos="1440"/>
+        </w:tabs>
+        <w:ind w:left="1440" w:hanging="360"/>
+      </w:pPr>
+      <w:rPr>
+        <w:rFonts w:ascii="Courier New" w:hAnsi="Courier New" w:hint="default"/>
+        <w:sz w:val="20"/>
+      </w:rPr>
+    </w:lvl>
+    <w:lvl w:ilvl="2" w:tentative="1">
+      <w:start w:val="1"/>
+      <w:numFmt w:val="bullet"/>
+      <w:lvlText w:val=""/>
+      <w:lvlJc w:val="left"/>
+      <w:pPr>
+        <w:tabs>
+          <w:tab w:val="num" w:pos="2160"/>
+        </w:tabs>
+        <w:ind w:left="2160" w:hanging="360"/>
+      </w:pPr>
+      <w:rPr>
+        <w:rFonts w:ascii="Wingdings" w:hAnsi="Wingdings" w:hint="default"/>
+        <w:sz w:val="20"/>
+      </w:rPr>
+    </w:lvl>
+    <w:lvl w:ilvl="3" w:tentative="1">
+      <w:start w:val="1"/>
+      <w:numFmt w:val="bullet"/>
+      <w:lvlText w:val=""/>
+      <w:lvlJc w:val="left"/>
+      <w:pPr>
+        <w:tabs>
+          <w:tab w:val="num" w:pos="2880"/>
+        </w:tabs>
+        <w:ind w:left="2880" w:hanging="360"/>
+      </w:pPr>
+      <w:rPr>
+        <w:rFonts w:ascii="Wingdings" w:hAnsi="Wingdings" w:hint="default"/>
+        <w:sz w:val="20"/>
+      </w:rPr>
+    </w:lvl>
+    <w:lvl w:ilvl="4" w:tentative="1">
+      <w:start w:val="1"/>
+      <w:numFmt w:val="bullet"/>
+      <w:lvlText w:val=""/>
+      <w:lvlJc w:val="left"/>
+      <w:pPr>
+        <w:tabs>
+          <w:tab w:val="num" w:pos="3600"/>
+        </w:tabs>
+        <w:ind w:left="3600" w:hanging="360"/>
+      </w:pPr>
+      <w:rPr>
+        <w:rFonts w:ascii="Wingdings" w:hAnsi="Wingdings" w:hint="default"/>
+        <w:sz w:val="20"/>
+      </w:rPr>
+    </w:lvl>
+    <w:lvl w:ilvl="5" w:tentative="1">
+      <w:start w:val="1"/>
+      <w:numFmt w:val="bullet"/>
+      <w:lvlText w:val=""/>
+      <w:lvlJc w:val="left"/>
+      <w:pPr>
+        <w:tabs>
+          <w:tab w:val="num" w:pos="4320"/>
+        </w:tabs>
+        <w:ind w:left="4320" w:hanging="360"/>
+      </w:pPr>
+      <w:rPr>
+        <w:rFonts w:ascii="Wingdings" w:hAnsi="Wingdings" w:hint="default"/>
+        <w:sz w:val="20"/>
+      </w:rPr>
+    </w:lvl>
+    <w:lvl w:ilvl="6" w:tentative="1">
+      <w:start w:val="1"/>
+      <w:numFmt w:val="bullet"/>
+      <w:lvlText w:val=""/>
+      <w:lvlJc w:val="left"/>
+      <w:pPr>
+        <w:tabs>
+          <w:tab w:val="num" w:pos="5040"/>
+        </w:tabs>
+        <w:ind w:left="5040" w:hanging="360"/>
+      </w:pPr>
+      <w:rPr>
+        <w:rFonts w:ascii="Wingdings" w:hAnsi="Wingdings" w:hint="default"/>
+        <w:sz w:val="20"/>
+      </w:rPr>
+    </w:lvl>
+    <w:lvl w:ilvl="7" w:tentative="1">
+      <w:start w:val="1"/>
+      <w:numFmt w:val="bullet"/>
+      <w:lvlText w:val=""/>
+      <w:lvlJc w:val="left"/>
+      <w:pPr>
+        <w:tabs>
+          <w:tab w:val="num" w:pos="5760"/>
+        </w:tabs>
+        <w:ind w:left="5760" w:hanging="360"/>
+      </w:pPr>
+      <w:rPr>
+        <w:rFonts w:ascii="Wingdings" w:hAnsi="Wingdings" w:hint="default"/>
+        <w:sz w:val="20"/>
+      </w:rPr>
+    </w:lvl>
+    <w:lvl w:ilvl="8" w:tentative="1">
+      <w:start w:val="1"/>
+      <w:numFmt w:val="bullet"/>
+      <w:lvlText w:val=""/>
+      <w:lvlJc w:val="left"/>
+      <w:pPr>
+        <w:tabs>
+          <w:tab w:val="num" w:pos="6480"/>
+        </w:tabs>
+        <w:ind w:left="6480" w:hanging="360"/>
+      </w:pPr>
+      <w:rPr>
+        <w:rFonts w:ascii="Wingdings" w:hAnsi="Wingdings" w:hint="default"/>
+        <w:sz w:val="20"/>
+      </w:rPr>
+    </w:lvl>
+  </w:abstractNum>
+  <w:abstractNum w:abstractNumId="6" w15:restartNumberingAfterBreak="0">
+    <w:nsid w:val="5F1D1E45"/>
+    <w:multiLevelType w:val="multilevel"/>
+    <w:tmpl w:val="FADE9D1A"/>
+    <w:lvl w:ilvl="0">
+      <w:start w:val="1"/>
+      <w:numFmt w:val="bullet"/>
+      <w:lvlText w:val=""/>
+      <w:lvlJc w:val="left"/>
+      <w:pPr>
+        <w:tabs>
+          <w:tab w:val="num" w:pos="720"/>
+        </w:tabs>
+        <w:ind w:left="720" w:hanging="360"/>
+      </w:pPr>
+      <w:rPr>
+        <w:rFonts w:ascii="Symbol" w:hAnsi="Symbol" w:hint="default"/>
+        <w:sz w:val="20"/>
+      </w:rPr>
+    </w:lvl>
+    <w:lvl w:ilvl="1" w:tentative="1">
+      <w:start w:val="1"/>
+      <w:numFmt w:val="bullet"/>
+      <w:lvlText w:val="o"/>
+      <w:lvlJc w:val="left"/>
+      <w:pPr>
+        <w:tabs>
+          <w:tab w:val="num" w:pos="1440"/>
+        </w:tabs>
+        <w:ind w:left="1440" w:hanging="360"/>
+      </w:pPr>
+      <w:rPr>
+        <w:rFonts w:ascii="Courier New" w:hAnsi="Courier New" w:hint="default"/>
+        <w:sz w:val="20"/>
+      </w:rPr>
+    </w:lvl>
+    <w:lvl w:ilvl="2" w:tentative="1">
+      <w:start w:val="1"/>
+      <w:numFmt w:val="bullet"/>
+      <w:lvlText w:val=""/>
+      <w:lvlJc w:val="left"/>
+      <w:pPr>
+        <w:tabs>
+          <w:tab w:val="num" w:pos="2160"/>
+        </w:tabs>
+        <w:ind w:left="2160" w:hanging="360"/>
+      </w:pPr>
+      <w:rPr>
+        <w:rFonts w:ascii="Wingdings" w:hAnsi="Wingdings" w:hint="default"/>
+        <w:sz w:val="20"/>
+      </w:rPr>
+    </w:lvl>
+    <w:lvl w:ilvl="3" w:tentative="1">
+      <w:start w:val="1"/>
+      <w:numFmt w:val="bullet"/>
+      <w:lvlText w:val=""/>
+      <w:lvlJc w:val="left"/>
+      <w:pPr>
+        <w:tabs>
+          <w:tab w:val="num" w:pos="2880"/>
+        </w:tabs>
+        <w:ind w:left="2880" w:hanging="360"/>
+      </w:pPr>
+      <w:rPr>
+        <w:rFonts w:ascii="Wingdings" w:hAnsi="Wingdings" w:hint="default"/>
+        <w:sz w:val="20"/>
+      </w:rPr>
+    </w:lvl>
+    <w:lvl w:ilvl="4" w:tentative="1">
+      <w:start w:val="1"/>
+      <w:numFmt w:val="bullet"/>
+      <w:lvlText w:val=""/>
+      <w:lvlJc w:val="left"/>
+      <w:pPr>
+        <w:tabs>
+          <w:tab w:val="num" w:pos="3600"/>
+        </w:tabs>
+        <w:ind w:left="3600" w:hanging="360"/>
+      </w:pPr>
+      <w:rPr>
+        <w:rFonts w:ascii="Wingdings" w:hAnsi="Wingdings" w:hint="default"/>
+        <w:sz w:val="20"/>
+      </w:rPr>
+    </w:lvl>
+    <w:lvl w:ilvl="5" w:tentative="1">
+      <w:start w:val="1"/>
+      <w:numFmt w:val="bullet"/>
+      <w:lvlText w:val=""/>
+      <w:lvlJc w:val="left"/>
+      <w:pPr>
+        <w:tabs>
+          <w:tab w:val="num" w:pos="4320"/>
+        </w:tabs>
+        <w:ind w:left="4320" w:hanging="360"/>
+      </w:pPr>
+      <w:rPr>
+        <w:rFonts w:ascii="Wingdings" w:hAnsi="Wingdings" w:hint="default"/>
+        <w:sz w:val="20"/>
+      </w:rPr>
+    </w:lvl>
+    <w:lvl w:ilvl="6" w:tentative="1">
+      <w:start w:val="1"/>
+      <w:numFmt w:val="bullet"/>
+      <w:lvlText w:val=""/>
+      <w:lvlJc w:val="left"/>
+      <w:pPr>
+        <w:tabs>
+          <w:tab w:val="num" w:pos="5040"/>
+        </w:tabs>
+        <w:ind w:left="5040" w:hanging="360"/>
+      </w:pPr>
+      <w:rPr>
+        <w:rFonts w:ascii="Wingdings" w:hAnsi="Wingdings" w:hint="default"/>
+        <w:sz w:val="20"/>
+      </w:rPr>
+    </w:lvl>
+    <w:lvl w:ilvl="7" w:tentative="1">
+      <w:start w:val="1"/>
+      <w:numFmt w:val="bullet"/>
+      <w:lvlText w:val=""/>
+      <w:lvlJc w:val="left"/>
+      <w:pPr>
+        <w:tabs>
+          <w:tab w:val="num" w:pos="5760"/>
+        </w:tabs>
+        <w:ind w:left="5760" w:hanging="360"/>
+      </w:pPr>
+      <w:rPr>
+        <w:rFonts w:ascii="Wingdings" w:hAnsi="Wingdings" w:hint="default"/>
+        <w:sz w:val="20"/>
+      </w:rPr>
+    </w:lvl>
+    <w:lvl w:ilvl="8" w:tentative="1">
+      <w:start w:val="1"/>
+      <w:numFmt w:val="bullet"/>
+      <w:lvlText w:val=""/>
+      <w:lvlJc w:val="left"/>
+      <w:pPr>
+        <w:tabs>
+          <w:tab w:val="num" w:pos="6480"/>
+        </w:tabs>
+        <w:ind w:left="6480" w:hanging="360"/>
+      </w:pPr>
+      <w:rPr>
+        <w:rFonts w:ascii="Wingdings" w:hAnsi="Wingdings" w:hint="default"/>
+        <w:sz w:val="20"/>
+      </w:rPr>
+    </w:lvl>
+  </w:abstractNum>
+  <w:abstractNum w:abstractNumId="7" w15:restartNumberingAfterBreak="0">
+    <w:nsid w:val="618B61DD"/>
+    <w:multiLevelType w:val="multilevel"/>
+    <w:tmpl w:val="2B16589C"/>
+    <w:lvl w:ilvl="0">
+      <w:start w:val="1"/>
+      <w:numFmt w:val="bullet"/>
+      <w:lvlText w:val=""/>
+      <w:lvlJc w:val="left"/>
+      <w:pPr>
+        <w:tabs>
+          <w:tab w:val="num" w:pos="720"/>
+        </w:tabs>
+        <w:ind w:left="720" w:hanging="360"/>
+      </w:pPr>
+      <w:rPr>
+        <w:rFonts w:ascii="Symbol" w:hAnsi="Symbol" w:hint="default"/>
+        <w:sz w:val="20"/>
+      </w:rPr>
+    </w:lvl>
+    <w:lvl w:ilvl="1" w:tentative="1">
+      <w:start w:val="1"/>
+      <w:numFmt w:val="bullet"/>
+      <w:lvlText w:val="o"/>
+      <w:lvlJc w:val="left"/>
+      <w:pPr>
+        <w:tabs>
+          <w:tab w:val="num" w:pos="1440"/>
+        </w:tabs>
+        <w:ind w:left="1440" w:hanging="360"/>
+      </w:pPr>
+      <w:rPr>
+        <w:rFonts w:ascii="Courier New" w:hAnsi="Courier New" w:hint="default"/>
+        <w:sz w:val="20"/>
+      </w:rPr>
+    </w:lvl>
+    <w:lvl w:ilvl="2" w:tentative="1">
+      <w:start w:val="1"/>
+      <w:numFmt w:val="bullet"/>
+      <w:lvlText w:val=""/>
+      <w:lvlJc w:val="left"/>
+      <w:pPr>
+        <w:tabs>
+          <w:tab w:val="num" w:pos="2160"/>
+        </w:tabs>
+        <w:ind w:left="2160" w:hanging="360"/>
+      </w:pPr>
+      <w:rPr>
+        <w:rFonts w:ascii="Wingdings" w:hAnsi="Wingdings" w:hint="default"/>
+        <w:sz w:val="20"/>
+      </w:rPr>
+    </w:lvl>
+    <w:lvl w:ilvl="3" w:tentative="1">
+      <w:start w:val="1"/>
+      <w:numFmt w:val="bullet"/>
+      <w:lvlText w:val=""/>
+      <w:lvlJc w:val="left"/>
+      <w:pPr>
+        <w:tabs>
+          <w:tab w:val="num" w:pos="2880"/>
+        </w:tabs>
+        <w:ind w:left="2880" w:hanging="360"/>
+      </w:pPr>
+      <w:rPr>
+        <w:rFonts w:ascii="Wingdings" w:hAnsi="Wingdings" w:hint="default"/>
+        <w:sz w:val="20"/>
+      </w:rPr>
+    </w:lvl>
+    <w:lvl w:ilvl="4" w:tentative="1">
+      <w:start w:val="1"/>
+      <w:numFmt w:val="bullet"/>
+      <w:lvlText w:val=""/>
+      <w:lvlJc w:val="left"/>
+      <w:pPr>
+        <w:tabs>
+          <w:tab w:val="num" w:pos="3600"/>
+        </w:tabs>
+        <w:ind w:left="3600" w:hanging="360"/>
+      </w:pPr>
+      <w:rPr>
+        <w:rFonts w:ascii="Wingdings" w:hAnsi="Wingdings" w:hint="default"/>
+        <w:sz w:val="20"/>
+      </w:rPr>
+    </w:lvl>
+    <w:lvl w:ilvl="5" w:tentative="1">
+      <w:start w:val="1"/>
+      <w:numFmt w:val="bullet"/>
+      <w:lvlText w:val=""/>
+      <w:lvlJc w:val="left"/>
+      <w:pPr>
+        <w:tabs>
+          <w:tab w:val="num" w:pos="4320"/>
+        </w:tabs>
+        <w:ind w:left="4320" w:hanging="360"/>
+      </w:pPr>
+      <w:rPr>
+        <w:rFonts w:ascii="Wingdings" w:hAnsi="Wingdings" w:hint="default"/>
+        <w:sz w:val="20"/>
+      </w:rPr>
+    </w:lvl>
+    <w:lvl w:ilvl="6" w:tentative="1">
+      <w:start w:val="1"/>
+      <w:numFmt w:val="bullet"/>
+      <w:lvlText w:val=""/>
+      <w:lvlJc w:val="left"/>
+      <w:pPr>
+        <w:tabs>
+          <w:tab w:val="num" w:pos="5040"/>
+        </w:tabs>
+        <w:ind w:left="5040" w:hanging="360"/>
+      </w:pPr>
+      <w:rPr>
+        <w:rFonts w:ascii="Wingdings" w:hAnsi="Wingdings" w:hint="default"/>
+        <w:sz w:val="20"/>
+      </w:rPr>
+    </w:lvl>
+    <w:lvl w:ilvl="7" w:tentative="1">
+      <w:start w:val="1"/>
+      <w:numFmt w:val="bullet"/>
+      <w:lvlText w:val=""/>
+      <w:lvlJc w:val="left"/>
+      <w:pPr>
+        <w:tabs>
+          <w:tab w:val="num" w:pos="5760"/>
+        </w:tabs>
+        <w:ind w:left="5760" w:hanging="360"/>
+      </w:pPr>
+      <w:rPr>
+        <w:rFonts w:ascii="Wingdings" w:hAnsi="Wingdings" w:hint="default"/>
+        <w:sz w:val="20"/>
+      </w:rPr>
+    </w:lvl>
+    <w:lvl w:ilvl="8" w:tentative="1">
+      <w:start w:val="1"/>
+      <w:numFmt w:val="bullet"/>
+      <w:lvlText w:val=""/>
+      <w:lvlJc w:val="left"/>
+      <w:pPr>
+        <w:tabs>
+          <w:tab w:val="num" w:pos="6480"/>
+        </w:tabs>
+        <w:ind w:left="6480" w:hanging="360"/>
+      </w:pPr>
+      <w:rPr>
+        <w:rFonts w:ascii="Wingdings" w:hAnsi="Wingdings" w:hint="default"/>
+        <w:sz w:val="20"/>
+      </w:rPr>
+    </w:lvl>
+  </w:abstractNum>
+  <w:abstractNum w:abstractNumId="8" w15:restartNumberingAfterBreak="0">
+    <w:nsid w:val="71483985"/>
+    <w:multiLevelType w:val="multilevel"/>
+    <w:tmpl w:val="CAC2FDFE"/>
+    <w:lvl w:ilvl="0">
+      <w:start w:val="1"/>
+      <w:numFmt w:val="bullet"/>
+      <w:lvlText w:val=""/>
+      <w:lvlJc w:val="left"/>
+      <w:pPr>
+        <w:tabs>
+          <w:tab w:val="num" w:pos="720"/>
+        </w:tabs>
+        <w:ind w:left="720" w:hanging="360"/>
+      </w:pPr>
+      <w:rPr>
+        <w:rFonts w:ascii="Symbol" w:hAnsi="Symbol" w:hint="default"/>
+        <w:sz w:val="20"/>
+      </w:rPr>
+    </w:lvl>
+    <w:lvl w:ilvl="1" w:tentative="1">
+      <w:start w:val="1"/>
+      <w:numFmt w:val="bullet"/>
+      <w:lvlText w:val="o"/>
+      <w:lvlJc w:val="left"/>
+      <w:pPr>
+        <w:tabs>
+          <w:tab w:val="num" w:pos="1440"/>
+        </w:tabs>
+        <w:ind w:left="1440" w:hanging="360"/>
+      </w:pPr>
+      <w:rPr>
+        <w:rFonts w:ascii="Courier New" w:hAnsi="Courier New" w:hint="default"/>
+        <w:sz w:val="20"/>
+      </w:rPr>
+    </w:lvl>
+    <w:lvl w:ilvl="2" w:tentative="1">
+      <w:start w:val="1"/>
+      <w:numFmt w:val="bullet"/>
+      <w:lvlText w:val=""/>
+      <w:lvlJc w:val="left"/>
+      <w:pPr>
+        <w:tabs>
+          <w:tab w:val="num" w:pos="2160"/>
+        </w:tabs>
+        <w:ind w:left="2160" w:hanging="360"/>
+      </w:pPr>
+      <w:rPr>
+        <w:rFonts w:ascii="Wingdings" w:hAnsi="Wingdings" w:hint="default"/>
+        <w:sz w:val="20"/>
+      </w:rPr>
+    </w:lvl>
+    <w:lvl w:ilvl="3" w:tentative="1">
+      <w:start w:val="1"/>
+      <w:numFmt w:val="bullet"/>
+      <w:lvlText w:val=""/>
+      <w:lvlJc w:val="left"/>
+      <w:pPr>
+        <w:tabs>
+          <w:tab w:val="num" w:pos="2880"/>
+        </w:tabs>
+        <w:ind w:left="2880" w:hanging="360"/>
+      </w:pPr>
+      <w:rPr>
+        <w:rFonts w:ascii="Wingdings" w:hAnsi="Wingdings" w:hint="default"/>
+        <w:sz w:val="20"/>
+      </w:rPr>
+    </w:lvl>
+    <w:lvl w:ilvl="4" w:tentative="1">
+      <w:start w:val="1"/>
+      <w:numFmt w:val="bullet"/>
+      <w:lvlText w:val=""/>
+      <w:lvlJc w:val="left"/>
+      <w:pPr>
+        <w:tabs>
+          <w:tab w:val="num" w:pos="3600"/>
+        </w:tabs>
+        <w:ind w:left="3600" w:hanging="360"/>
+      </w:pPr>
+      <w:rPr>
+        <w:rFonts w:ascii="Wingdings" w:hAnsi="Wingdings" w:hint="default"/>
+        <w:sz w:val="20"/>
+      </w:rPr>
+    </w:lvl>
+    <w:lvl w:ilvl="5" w:tentative="1">
+      <w:start w:val="1"/>
+      <w:numFmt w:val="bullet"/>
+      <w:lvlText w:val=""/>
+      <w:lvlJc w:val="left"/>
+      <w:pPr>
+        <w:tabs>
+          <w:tab w:val="num" w:pos="4320"/>
+        </w:tabs>
+        <w:ind w:left="4320" w:hanging="360"/>
+      </w:pPr>
+      <w:rPr>
+        <w:rFonts w:ascii="Wingdings" w:hAnsi="Wingdings" w:hint="default"/>
+        <w:sz w:val="20"/>
+      </w:rPr>
+    </w:lvl>
+    <w:lvl w:ilvl="6" w:tentative="1">
+      <w:start w:val="1"/>
+      <w:numFmt w:val="bullet"/>
+      <w:lvlText w:val=""/>
+      <w:lvlJc w:val="left"/>
+      <w:pPr>
+        <w:tabs>
+          <w:tab w:val="num" w:pos="5040"/>
+        </w:tabs>
+        <w:ind w:left="5040" w:hanging="360"/>
+      </w:pPr>
+      <w:rPr>
+        <w:rFonts w:ascii="Wingdings" w:hAnsi="Wingdings" w:hint="default"/>
+        <w:sz w:val="20"/>
+      </w:rPr>
+    </w:lvl>
+    <w:lvl w:ilvl="7" w:tentative="1">
+      <w:start w:val="1"/>
+      <w:numFmt w:val="bullet"/>
+      <w:lvlText w:val=""/>
+      <w:lvlJc w:val="left"/>
+      <w:pPr>
+        <w:tabs>
+          <w:tab w:val="num" w:pos="5760"/>
+        </w:tabs>
+        <w:ind w:left="5760" w:hanging="360"/>
+      </w:pPr>
+      <w:rPr>
+        <w:rFonts w:ascii="Wingdings" w:hAnsi="Wingdings" w:hint="default"/>
+        <w:sz w:val="20"/>
+      </w:rPr>
+    </w:lvl>
+    <w:lvl w:ilvl="8" w:tentative="1">
+      <w:start w:val="1"/>
+      <w:numFmt w:val="bullet"/>
+      <w:lvlText w:val=""/>
+      <w:lvlJc w:val="left"/>
+      <w:pPr>
+        <w:tabs>
+          <w:tab w:val="num" w:pos="6480"/>
+        </w:tabs>
+        <w:ind w:left="6480" w:hanging="360"/>
+      </w:pPr>
+      <w:rPr>
+        <w:rFonts w:ascii="Wingdings" w:hAnsi="Wingdings" w:hint="default"/>
+        <w:sz w:val="20"/>
+      </w:rPr>
+    </w:lvl>
+  </w:abstractNum>
   <w:num w:numId="1" w16cid:durableId="587664330">
+    <w:abstractNumId w:val="4"/>
+  </w:num>
+  <w:num w:numId="2" w16cid:durableId="1819877983">
+    <w:abstractNumId w:val="3"/>
+  </w:num>
+  <w:num w:numId="3" w16cid:durableId="1929609068">
+    <w:abstractNumId w:val="7"/>
+  </w:num>
+  <w:num w:numId="4" w16cid:durableId="1776556982">
     <w:abstractNumId w:val="0"/>
+  </w:num>
+  <w:num w:numId="5" w16cid:durableId="1322731223">
+    <w:abstractNumId w:val="5"/>
+  </w:num>
+  <w:num w:numId="6" w16cid:durableId="1504975849">
+    <w:abstractNumId w:val="8"/>
+  </w:num>
+  <w:num w:numId="7" w16cid:durableId="1269896894">
+    <w:abstractNumId w:val="6"/>
+  </w:num>
+  <w:num w:numId="8" w16cid:durableId="1684044852">
+    <w:abstractNumId w:val="1"/>
+  </w:num>
+  <w:num w:numId="9" w16cid:durableId="389693220">
+    <w:abstractNumId w:val="2"/>
   </w:num>
 </w:numbering>
 </file>
@@ -881,7 +2678,6 @@
   <w:style w:type="character" w:default="1" w:styleId="DefaultParagraphFont">
     <w:name w:val="Default Paragraph Font"/>
     <w:uiPriority w:val="1"/>
-    <w:semiHidden/>
     <w:unhideWhenUsed/>
   </w:style>
   <w:style w:type="table" w:default="1" w:styleId="TableNormal">

</xml_diff>

<commit_message>
fix bug website, connect website and app, change operation
</commit_message>
<xml_diff>
--- a/documents/Mô tả nghiệp vụ.docx
+++ b/documents/Mô tả nghiệp vụ.docx
@@ -29,11 +29,6 @@
     </w:p>
     <w:p>
       <w:pPr>
-        <w:pStyle w:val="ListParagraph"/>
-        <w:numPr>
-          <w:ilvl w:val="0"/>
-          <w:numId w:val="1"/>
-        </w:numPr>
         <w:jc w:val="both"/>
       </w:pPr>
       <w:r>
@@ -66,11 +61,6 @@
     </w:p>
     <w:p>
       <w:pPr>
-        <w:pStyle w:val="ListParagraph"/>
-        <w:numPr>
-          <w:ilvl w:val="0"/>
-          <w:numId w:val="1"/>
-        </w:numPr>
         <w:jc w:val="both"/>
       </w:pPr>
       <w:r>
@@ -86,16 +76,11 @@
         <w:t xml:space="preserve">: danh sách sinh viên </w:t>
       </w:r>
       <w:r>
-        <w:t xml:space="preserve">vi phạm tác phong, thời điểm và địa điểm vi phạm cao </w:t>
-      </w:r>
-      <w:proofErr w:type="gramStart"/>
-      <w:r>
-        <w:t>điểm,</w:t>
+        <w:t>vi phạm tác phong, thời điểm và địa điểm vi phạm cao điểm,</w:t>
       </w:r>
       <w:r>
         <w:t>…</w:t>
       </w:r>
-      <w:proofErr w:type="gramEnd"/>
       <w:r>
         <w:t xml:space="preserve"> và gửi thông tin này về các ban quản lý cao hơn</w:t>
       </w:r>
@@ -2678,6 +2663,7 @@
   <w:style w:type="character" w:default="1" w:styleId="DefaultParagraphFont">
     <w:name w:val="Default Paragraph Font"/>
     <w:uiPriority w:val="1"/>
+    <w:semiHidden/>
     <w:unhideWhenUsed/>
   </w:style>
   <w:style w:type="table" w:default="1" w:styleId="TableNormal">

</xml_diff>